<commit_message>
No italic anywhere in a resume
I re-added italic to the sample's degree lines, treating a deliberate edit as
drift. It was intentional. Reverted, and the underlying rule is now written down
rather than left implicit.

house-style.md states it outright: the document has three levels of emphasis,
bold, underlined section headers, and regular weight. Italic at 11pt prints
faintly and adds a fourth signal the reader has to decode for nothing bold and
position do not already provide. The education section no longer specifies an
italic degree line.

Checklist gains item 5, no italic anywhere, flagging any italic run. Renumbered
to 35 items and the count updated in the review skill and README.

Sample asset re-exported and verified to contain zero italic runs.
</commit_message>
<xml_diff>
--- a/plugins/resume-forge/assets/SoftwareEngineer_AlexMoreno.docx
+++ b/plugins/resume-forge/assets/SoftwareEngineer_AlexMoreno.docx
@@ -1163,19 +1163,15 @@
         <w:ind w:left="-360" w:right="-360" w:firstLine="0"/>
         <w:jc w:val="left"/>
         <w:rPr>
-          <w:i w:val="1"/>
-          <w:iCs w:val="1"/>
-          <w:sz w:val="22"/>
-          <w:szCs w:val="22"/>
-        </w:rPr>
-      </w:pPr>
-      <w:r>
-        <w:rPr>
-          <w:rFonts w:ascii="Calibri" w:cs="Calibri" w:eastAsia="Calibri" w:hAnsi="Calibri"/>
-          <w:b w:val="0"/>
-          <w:bCs w:val="0"/>
-          <w:i w:val="1"/>
-          <w:iCs w:val="1"/>
+          <w:sz w:val="22"/>
+          <w:szCs w:val="22"/>
+        </w:rPr>
+      </w:pPr>
+      <w:r>
+        <w:rPr>
+          <w:rFonts w:ascii="Calibri" w:cs="Calibri" w:eastAsia="Calibri" w:hAnsi="Calibri"/>
+          <w:b w:val="0"/>
+          <w:bCs w:val="0"/>
           <w:color w:val="000000"/>
           <w:sz w:val="22"/>
           <w:szCs w:val="22"/>
@@ -1275,20 +1271,16 @@
           <w:rFonts w:ascii="Calibri" w:cs="Calibri" w:eastAsia="Calibri" w:hAnsi="Calibri"/>
           <w:b w:val="0"/>
           <w:bCs w:val="0"/>
-          <w:i w:val="1"/>
-          <w:iCs w:val="1"/>
-          <w:color w:val="000000"/>
-          <w:sz w:val="22"/>
-          <w:szCs w:val="22"/>
-        </w:rPr>
-      </w:pPr>
-      <w:r>
-        <w:rPr>
-          <w:rFonts w:ascii="Calibri" w:cs="Calibri" w:eastAsia="Calibri" w:hAnsi="Calibri"/>
-          <w:b w:val="0"/>
-          <w:bCs w:val="0"/>
-          <w:i w:val="1"/>
-          <w:iCs w:val="1"/>
+          <w:color w:val="000000"/>
+          <w:sz w:val="22"/>
+          <w:szCs w:val="22"/>
+        </w:rPr>
+      </w:pPr>
+      <w:r>
+        <w:rPr>
+          <w:rFonts w:ascii="Calibri" w:cs="Calibri" w:eastAsia="Calibri" w:hAnsi="Calibri"/>
+          <w:b w:val="0"/>
+          <w:bCs w:val="0"/>
           <w:color w:val="000000"/>
           <w:sz w:val="22"/>
           <w:szCs w:val="22"/>

</xml_diff>